<commit_message>
Corrige numeracion para equivalencias no otorgadas
</commit_message>
<xml_diff>
--- a/resoluciones/templates/template_no_otorgadas.docx
+++ b/resoluciones/templates/template_no_otorgadas.docx
@@ -1133,7 +1133,7 @@
           <w:sz w:val="24"/>
           <w:szCs w:val="24"/>
         </w:rPr>
-        <w:t xml:space="preserve"> asignatura de {{equivalencias}}, </w:t>
+        <w:t xml:space="preserve"> asignatura de {{equivalencias_no_corresponde}}, </w:t>
       </w:r>
       <w:r>
         <w:rPr>
@@ -2099,7 +2099,7 @@
           <w:sz w:val="24"/>
           <w:szCs w:val="24"/>
         </w:rPr>
-        <w:t xml:space="preserve">{% if hay_no_corresponden %}Art. 2.- NO HACER LUGAR  a la solicitud de equivalencias de la asignatura de {{equivalencias}}, presentada por el/la Sr/a. </w:t>
+        <w:t xml:space="preserve">Art. 1.- NO HACER LUGAR  a la solicitud de equivalencias de la asignatura de {{equivalencias_no_corresponde}}, presentada por el/la Sr/a. </w:t>
       </w:r>
       <w:r>
         <w:rPr>
@@ -2889,7 +2889,7 @@
           <w:sz w:val="24"/>
           <w:szCs w:val="24"/>
         </w:rPr>
-        <w:t>{{ no_corresponde_texto }}. Art. 3{% else %}Art. 2{% endif %}°.- PROTOCOLÍCESE, </w:t>
+        <w:t>{{ no_corresponde_texto }}. Art. 2°.- PROTOCOLÍCESE, </w:t>
       </w:r>
       <w:r>
         <w:rPr>

</xml_diff>